<commit_message>
Update Introduction document formatting
</commit_message>
<xml_diff>
--- a/NODDI_Diffusion_MRI_Dashboard.docx
+++ b/NODDI_Diffusion_MRI_Dashboard.docx
@@ -4,12 +4,23 @@
   <w:body>
     <w:p>
       <w:pPr>
-        <w:pStyle w:val="Heading1"/>
+        <w:pStyle w:val="Heading2"/>
         <w:keepNext w:val="true"/>
         <w:keepLines/>
         <w:spacing w:before="360" w:after="80"/>
         <w:rPr/>
       </w:pPr>
+      <w:r>
+        <w:rPr/>
+        <w:t>Introduction</w:t>
+      </w:r>
+    </w:p>
+    <w:p>
+      <w:pPr>
+        <w:pStyle w:val="Heading1"/>
+        <w:spacing w:before="360" w:after="80"/>
+        <w:rPr/>
+      </w:pPr>
       <w:bookmarkStart w:id="0" w:name="unc-noddi-diffusion-mri-dashboard"/>
       <w:r>
         <w:rPr/>
@@ -24,27 +35,7 @@
       </w:pPr>
       <w:r>
         <w:rPr/>
-        <w:t xml:space="preserve">Prepared by Todd L. Richards, PhD, University of Washington under the direction of Project Leader, James Meabon, Seattle VA Hospital.  The software </w:t>
-      </w:r>
-      <w:r>
-        <w:rPr/>
-        <w:t>for the dashboard</w:t>
-      </w:r>
-      <w:r>
-        <w:rPr/>
-        <w:t xml:space="preserve"> was developed with the help of AI chatgpt version 5.0 after instructions were given by Dr. Richards and ou</w:t>
-      </w:r>
-      <w:r>
-        <w:rPr/>
-        <w:t>t</w:t>
-      </w:r>
-      <w:r>
-        <w:rPr/>
-        <w:t xml:space="preserve">put </w:t>
-      </w:r>
-      <w:r>
-        <w:rPr/>
-        <w:t>results were checked.</w:t>
+        <w:t>Prepared by Todd L. Richards, PhD, University of Washington under the direction of Project Leader, James Meabon, Seattle VA Hospital.  The software for the dashboard was developed with the help of AI chatgpt version 5.0 after instructions were given by Dr. Richards and output results were checked.</w:t>
       </w:r>
     </w:p>
     <w:p>
@@ -54,7 +45,6 @@
       </w:pPr>
       <w:r>
         <w:rPr/>
-        <w:t>Introduction</w:t>
       </w:r>
     </w:p>
     <w:p>

</xml_diff>